<commit_message>
Major revision: reframe as network exclusion and technology flow disruption
Key changes:
- Title: 'Network Exclusion and State Collapse: From Maritime Isolation
  to Technological Access Denial in the Long Run of History'
- New theoretical framework: technology flow disruption → cumulative
  civilization-level gap → tragedy of first contact
- Dose-response pattern: tech exclusion (100%) > policy ban > bloc > open
- Discussion expanded: 6.1 mechanism, 6.2 first contact/civilizational
  divergence (Diamond 1997), 6.3 modern tech exclusion (AI/semiconductor),
  6.4 stock-flow robustness, 6.5 limitations
- References added: Diamond & Bellwood (2003) Science, Acemoglu et al.
  (2002) QJE, Comin et al. (2010) AEJ:Macro, Mokyr (2002)
- Cover letter updated with new framing
- STROBE checklist updated to reflect new section structure
- English naturalness improved throughout

Co-Authored-By: Tatsuki Onishi <bougtoir@gmail.com>
</commit_message>
<xml_diff>
--- a/manuscript/cover_letter.docx
+++ b/manuscript/cover_letter.docx
@@ -47,7 +47,7 @@
         <w:rPr>
           <w:b/>
         </w:rPr>
-        <w:t>"Flow Disruption and State Collapse: A Sensitivity Analysis of Technical Maritime Bans in Historical National Power Dynamics"</w:t>
+        <w:t>"Network Exclusion and State Collapse: From Maritime Isolation to Technological Access Denial in the Long Run of History"</w:t>
       </w:r>
     </w:p>
     <w:p/>
@@ -64,22 +64,22 @@
     </w:p>
     <w:p>
       <w:r>
-        <w:t>The manuscript examines the relationship between international flow disruption and state collapse using a cross-historical dataset of 96 polities spanning six eras from antiquity to the present. Our main contribution is twofold: (1) we introduce the concept of 'technical maritime ban'—the passive isolation of polities due to the absence of regular maritime routes, as distinct from deliberate policy-based closures—and (2) we conduct a systematic sensitivity analysis to test whether the observed association between maritime closure and conquest is robust to how isolation is defined.</w:t>
+        <w:t>The manuscript addresses a fundamental question in economic history: why does exclusion from international exchange networks so reliably precede state collapse? Using a comparative dataset of 96 historical polities spanning antiquity to the present, we distinguish between deliberate closure (policy-based maritime bans, sakoku) and what we term 'technical network exclusion'—involuntary disconnection from the dominant exchange network of an era due to geographic or technological constraints. We argue that the critical channel is technology flow: technically excluded polities were severed not just from trade but from the diffusion of military techniques, institutional innovations, and frontier knowledge.</w:t>
       </w:r>
     </w:p>
     <w:p>
       <w:r>
-        <w:t>Our key finding is that reclassifying seven historically isolated polities—including the Han Dynasty, the Khmer Empire, and Kievan Rus'—from 'no closure' to 'technical maritime ban' transforms a non-significant baseline association (Fisher's exact test p = 0.187) into a statistically significant one (p = 0.020). Notably, all seven technically isolated polities were eventually conquered (100% conquest rate). Meanwhile, the core stock-flow confusion matrix odds ratio (OR = 1.774) remains unchanged across all reclassification scenarios, suggesting that the mechanism driving the closure-conquest association is flow disruption per se rather than policy intent.</w:t>
+        <w:t>Reclassifying seven technically excluded polities—including the Han Dynasty, the Khmer Empire, and Kievan Rus'—transforms a non-significant baseline association between closure and conquest (Fisher's exact test p = 0.187) into a significant one (p = 0.020). All seven were eventually conquered. A dose–response gradient emerges across closure types: technical exclusion (zero technology transfer) shows a 100% conquest rate, policy bans (reduced but non-zero transfer) show rates below 80%, and open polities show the lowest rates. The core stock–flow odds ratio (OR = 1.774) remains invariant across all reclassification scenarios.</w:t>
       </w:r>
     </w:p>
     <w:p>
       <w:r>
-        <w:t>We believe this manuscript is well suited to Cliometrica for several reasons. First, it combines quantitative methods (Fisher's exact test, multivariate logistic regression, bootstrap validation) with a novel historical dataset, which aligns with the journal's focus on econometric history and historical economics. Second, the 'technical maritime ban' concept offers a new dimension to the long-standing debate on trade openness and state survival, complementing seminal works by Findlay and O'Rourke (2007) and Kennedy (1987). Third, the sensitivity analysis framework provides a replicable template for other researchers working with categorical historical data.</w:t>
+        <w:t>We believe this manuscript offers three features that may interest Cliometrica's readership. First, it provides a quantitative restatement of the long-recognized pattern that contact between civilizations at different technological levels tends to end unfavorably for the less advanced party (Diamond 1997)—but grounded in a systematic, cross-historical dataset rather than selective case studies. Second, the technology-flow mechanism we propose generalizes beyond maritime isolation: as the dominant network shifts from sea lanes to semiconductors, AI infrastructure, and advanced robotics, the same logic of cumulative divergence through exclusion may apply to contemporary states. Third, the sensitivity analysis framework (3 reclassification levels × 2 outcome assignments = 6 scenarios) provides a replicable template for other researchers working with categorical historical data.</w:t>
       </w:r>
     </w:p>
     <w:p>
       <w:r>
-        <w:t>The manuscript comprises approximately 8,000 words of body text, 3 tables, 4 figures, and one supplementary table (Table S1) listing all 96 polities with their modern-country equivalents, periods of existence, and specific turning-point events. All data and code are available upon request.</w:t>
+        <w:t>The manuscript comprises approximately 8,500 words of body text, 3 tables, 4 figures, and one supplementary table (Table S1) listing all 96 polities with modern-country equivalents, periods of existence, and specific turning-point events. All data and code are available upon request.</w:t>
       </w:r>
     </w:p>
     <w:p>

</xml_diff>

<commit_message>
Update cover letter: add conditional closure as 4th feature, 4 tables
- Changed 'three features' to 'four features' with new second point:
  conditional closure analysis (rangaku, Canton system, mixed outcomes)
- Updated manuscript stats: 3 tables → 4 tables, ~8500 → ~9000 words

Co-Authored-By: Tatsuki Onishi <bougtoir@gmail.com>
</commit_message>
<xml_diff>
--- a/manuscript/cover_letter.docx
+++ b/manuscript/cover_letter.docx
@@ -74,12 +74,12 @@
     </w:p>
     <w:p>
       <w:r>
-        <w:t>We believe this manuscript offers three features that may interest Cliometrica's readership. First, it provides a quantitative restatement of the long-recognized pattern that contact between civilizations at different technological levels tends to end unfavorably for the less advanced party (Diamond 1997)—but grounded in a systematic, cross-historical dataset rather than selective case studies. Second, the technology-flow mechanism we propose generalizes beyond maritime isolation: as the dominant network shifts from sea lanes to semiconductors, AI infrastructure, and advanced robotics, the same logic of cumulative divergence through exclusion may apply to contemporary states. Third, the sensitivity analysis framework (3 reclassification levels × 2 outcome assignments = 6 scenarios) provides a replicable template for other researchers working with categorical historical data.</w:t>
+        <w:t>We believe this manuscript offers four features that may interest Cliometrica’s readership. First, it provides a quantitative restatement of the long-recognized pattern that contact between civilizations at different technological levels tends to end unfavorably for the less advanced party (Diamond 1997)—but grounded in a systematic, cross-historical dataset rather than selective case studies. Second, we examine polities that pursued conditional closure—restricting broad engagement while deliberately maintaining selective technology transfer channels (e.g., Tokugawa Japan’s rangaku, Qing China’s Canton system)—and find mixed outcomes, suggesting that the policy question is not binary (open or closed) but conditional on which channels are preserved. Third, the technology-flow mechanism we propose generalizes beyond maritime isolation: as the dominant network shifts from sea lanes to semiconductors, AI infrastructure, and advanced robotics, the same logic of cumulative divergence through exclusion may apply to contemporary states. Fourth, the sensitivity analysis framework (3 reclassification levels × 2 outcome assignments = 6 scenarios) provides a replicable template for other researchers working with categorical historical data.</w:t>
       </w:r>
     </w:p>
     <w:p>
       <w:r>
-        <w:t>The manuscript comprises approximately 8,500 words of body text, 3 tables, 4 figures, and one supplementary table (Table S1) listing all 96 polities with modern-country equivalents, periods of existence, and specific turning-point events. All data and code are available upon request.</w:t>
+        <w:t>The manuscript comprises approximately 9,000 words of body text, 4 tables, 4 figures, and one supplementary table (Table S1) listing all 96 polities with modern-country equivalents, periods of existence, and specific turning-point events. All data and code are available upon request.</w:t>
       </w:r>
     </w:p>
     <w:p>

</xml_diff>

<commit_message>
EEH投稿書類一式: manuscript.docx, cover_letter.docx, figures_pptx.pptx 再生成
- manuscript.docx: Harvard引用形式、図表インライン、本文約7,000語
- cover_letter.docx: EEH宛カバーレター（語数修正）
- figures_pptx.pptx: 編集可能な図版（1スライド/1図）
- 生成スクリプト追加（generate_docx.py等）

Co-Authored-By: Tatsuki Onishi <bougtoir@gmail.com>
</commit_message>
<xml_diff>
--- a/manuscript/cover_letter.docx
+++ b/manuscript/cover_letter.docx
@@ -3,9 +3,6 @@
 <w:document xmlns:wpc="http://schemas.microsoft.com/office/word/2010/wordprocessingCanvas" xmlns:mo="http://schemas.microsoft.com/office/mac/office/2008/main" xmlns:mc="http://schemas.openxmlformats.org/markup-compatibility/2006" xmlns:mv="urn:schemas-microsoft-com:mac:vml" xmlns:o="urn:schemas-microsoft-com:office:office" xmlns:r="http://schemas.openxmlformats.org/officeDocument/2006/relationships" xmlns:m="http://schemas.openxmlformats.org/officeDocument/2006/math" xmlns:v="urn:schemas-microsoft-com:vml" xmlns:wp14="http://schemas.microsoft.com/office/word/2010/wordprocessingDrawing" xmlns:wp="http://schemas.openxmlformats.org/drawingml/2006/wordprocessingDrawing" xmlns:w10="urn:schemas-microsoft-com:office:word" xmlns:w="http://schemas.openxmlformats.org/wordprocessingml/2006/main" xmlns:w14="http://schemas.microsoft.com/office/word/2010/wordml" xmlns:wpg="http://schemas.microsoft.com/office/word/2010/wordprocessingGroup" xmlns:wpi="http://schemas.microsoft.com/office/word/2010/wordprocessingInk" xmlns:wne="http://schemas.microsoft.com/office/word/2006/wordml" xmlns:wps="http://schemas.microsoft.com/office/word/2010/wordprocessingShape" mc:Ignorable="w14 wp14">
   <w:body>
     <w:p>
-      <w:pPr>
-        <w:jc w:val="left"/>
-      </w:pPr>
       <w:r>
         <w:t>[Date]</w:t>
       </w:r>
@@ -13,131 +10,91 @@
     <w:p/>
     <w:p>
       <w:r>
-        <w:rPr>
-          <w:b w:val="0"/>
-        </w:rPr>
-        <w:t>Professor Claude Diebolt</w:t>
-        <w:br/>
-        <w:t xml:space="preserve">Managing Editor, </w:t>
+        <w:t>The Editors</w:t>
       </w:r>
+    </w:p>
+    <w:p>
       <w:r>
         <w:rPr>
           <w:i/>
         </w:rPr>
-        <w:t>Cliometrica</w:t>
-      </w:r>
-      <w:r>
-        <w:br/>
-        <w:t>BETA/CNRS, University of Strasbourg</w:t>
-        <w:br/>
-        <w:t>61 Avenue de la Forêt Noire</w:t>
-        <w:br/>
-        <w:t>67085 Strasbourg Cedex, France</w:t>
+        <w:t>Explorations in Economic History</w:t>
       </w:r>
     </w:p>
     <w:p/>
     <w:p>
       <w:r>
-        <w:rPr>
-          <w:b/>
-        </w:rPr>
-        <w:t xml:space="preserve">Re: Submission of original manuscript — </w:t>
-      </w:r>
-      <w:r>
-        <w:rPr>
-          <w:b/>
-        </w:rPr>
-        <w:t>"Network Exclusion and State Collapse: From Maritime Isolation to Technological Access Denial in the Long Run of History"</w:t>
+        <w:t>Dear Editors,</w:t>
       </w:r>
     </w:p>
     <w:p/>
     <w:p>
       <w:r>
-        <w:t>Dear Professor Diebolt,</w:t>
-      </w:r>
-    </w:p>
-    <w:p/>
-    <w:p>
-      <w:r>
-        <w:t>We are pleased to submit the above-titled manuscript for consideration for publication in Cliometrica. This manuscript has not been published elsewhere and is not under consideration by any other journal. All authors have approved the manuscript and agree with its submission to Cliometrica.</w:t>
+        <w:t>I am pleased to submit the manuscript entitled "Network Exclusion and State Collapse: From Maritime Isolation to Technological Access Denial in the Long Run of History" for consideration by Explorations in Economic History.</w:t>
       </w:r>
     </w:p>
     <w:p>
       <w:r>
-        <w:t>The manuscript addresses a fundamental question in economic history: why does exclusion from international exchange networks so reliably precede state collapse? Using a comparative dataset of 96 historical polities spanning antiquity to the present, we distinguish between deliberate closure (policy-based trade bans, sakoku) and what we term 'technical network exclusion'—involuntary disconnection from the dominant exchange network of an era due to geographic or technological constraints. We argue that the critical channel is technology flow: technically excluded polities were severed not just from trade but from the diffusion of military techniques, institutional innovations, and frontier knowledge.</w:t>
+        <w:t>Using a comparative dataset of 96 historical polities spanning antiquity to the present, we distinguish between deliberate closure (policy-based trade bans, sakoku, bloc membership) and what we term "technical network exclusion": involuntary disconnection from the dominant exchange network of an era due to geographic or technological constraints. The manuscript presents four features that we believe are of interest to the journal's readership.</w:t>
       </w:r>
     </w:p>
     <w:p>
       <w:r>
-        <w:t>Reclassifying seven technically excluded polities—including the Han Dynasty, the Khmer Empire, and Kievan Rus'—transforms a non-significant baseline association between closure and conquest (Fisher's exact test p = 0.187) into a significant one (p = 0.020). All seven were eventually conquered. A dose–response gradient emerges across closure types: technical exclusion (zero technology transfer) shows a 100% conquest rate, policy bans (reduced but non-zero transfer) show rates below 80%, and open polities show the lowest rates. The core stock–flow odds ratio (OR = 1.774) remains invariant across all reclassification scenarios.</w:t>
+        <w:t>First, a systematic sensitivity analysis demonstrates that reclassifying seven technically excluded polities transforms a non-significant association between closure and conquest (Fisher's exact p = 0.187) into a significant one (p = 0.020), while the core stock–flow odds ratio remains stable (OR = 1.774).</w:t>
       </w:r>
     </w:p>
     <w:p>
       <w:r>
-        <w:t>We believe this manuscript offers four features that may interest Cliometrica’s readership. First, it provides a quantitative restatement of the long-recognized pattern that contact between civilizations at different technological levels tends to end unfavorably for the less advanced party (Diamond 1997)—but grounded in a systematic, cross-historical dataset rather than selective case studies. Second, we examine polities that pursued conditional closure—restricting broad engagement while deliberately maintaining selective technology transfer channels (e.g., Tokugawa Japan’s rangaku, Qing China’s Canton system)—and find mixed outcomes, suggesting that the policy question is not binary (open or closed) but conditional on which channels are preserved. Third, the technology-flow mechanism we propose generalizes beyond geographic isolation: as the dominant network shifts from sea lanes to semiconductors, AI infrastructure, and advanced robotics, the same logic of cumulative divergence through exclusion may apply to contemporary states. Fourth, the sensitivity analysis framework (3 reclassification levels × 2 outcome assignments = 6 scenarios) provides a replicable template for other researchers working with categorical historical data.</w:t>
+        <w:t>Second, we analyze conditional closure—cases where polities maintained selective technology channels while restricting broader trade. Examples include Tokugawa Japan's rangaku through Dejima, Qing China's Canton system, Joseon Korea's tributary trade, and the Soviet Union's bloc-internal technology sharing. The mixed outcomes of these cases suggest that the open/closed dichotomy is insufficient; the conditions under which selective channels mitigate technology gaps merit further investigation.</w:t>
       </w:r>
     </w:p>
     <w:p>
       <w:r>
-        <w:t>The manuscript comprises approximately 9,000 words of body text, 4 tables, 4 figures, and one supplementary table (Table S1) listing all 96 polities with modern-country equivalents, periods of existence, and specific turning-point events. All data and code are available upon request.</w:t>
+        <w:t>Third, the dose–response gradient across closure types—technical exclusion (100% conquest) &gt; policy bans &gt; sakoku (with partial conduit) &gt; bloc &gt; open—points to technology flow disruption, rather than trade restriction per se, as the critical mechanism.</w:t>
       </w:r>
     </w:p>
     <w:p>
       <w:r>
-        <w:t>We confirm that this work is original, has not been published before, and is not being considered for publication elsewhere. There are no competing interests to declare. No external funding was received for this research.</w:t>
+        <w:t>Fourth, the mechanism generalizes beyond geographic isolation: as the dominant network shifts from sea lanes to semiconductors, AI, and advanced robotics, states structurally excluded from these platforms may face analogous vulnerabilities.</w:t>
       </w:r>
     </w:p>
     <w:p>
       <w:r>
-        <w:t>We suggest the following researchers as potential reviewers, given their expertise in quantitative economic history and cliometrics:</w:t>
+        <w:t>We probe the closure–conquest association with four causal identification strategies—instrumental variables, propensity score matching, a natural experiment framing, and a robustness battery including E-values, permutation tests, and leave-one-out analysis. The strongest evidence comes from the natural experiment approach: technically excluded polities show a 100% conquest rate compared with 62.3% for open polities (Fisher's exact p = 0.048), with no significant differences in observable covariates.</w:t>
+      </w:r>
+    </w:p>
+    <w:p>
+      <w:r>
+        <w:t>The manuscript contains approximately 7,000 words, 5 tables, and 4 figures. Supplementary Table S1 provides the complete dataset. We confirm that this work has not been published or submitted elsewhere.</w:t>
+      </w:r>
+    </w:p>
+    <w:p>
+      <w:r>
+        <w:t>We suggest the following reviewers based on their expertise in quantitative economic history:</w:t>
       </w:r>
     </w:p>
     <w:p>
       <w:pPr>
-        <w:pStyle w:val="ListBullet"/>
+        <w:ind w:left="720"/>
       </w:pPr>
       <w:r>
-        <w:rPr>
-          <w:b/>
-        </w:rPr>
-        <w:t>Jörg Baten</w:t>
-      </w:r>
-      <w:r>
-        <w:t xml:space="preserve"> (University of Tübingen) — quantitative historical data analysis</w:t>
+        <w:t>• Prof. Jörg Baten (University of Tübingen) — cliometric methods and long-run development</w:t>
       </w:r>
     </w:p>
     <w:p>
       <w:pPr>
-        <w:pStyle w:val="ListBullet"/>
+        <w:ind w:left="720"/>
       </w:pPr>
       <w:r>
-        <w:rPr>
-          <w:b/>
-        </w:rPr>
-        <w:t>Stephen Broadberry</w:t>
-      </w:r>
-      <w:r>
-        <w:t xml:space="preserve"> (University of Oxford) — long-run comparative economic history</w:t>
+        <w:t>• Prof. Stephen Broadberry (University of Oxford) — comparative economic history and GDP estimation</w:t>
       </w:r>
     </w:p>
     <w:p>
       <w:pPr>
-        <w:pStyle w:val="ListBullet"/>
+        <w:ind w:left="720"/>
       </w:pPr>
       <w:r>
-        <w:rPr>
-          <w:b/>
-        </w:rPr>
-        <w:t>Peter Turchin</w:t>
-      </w:r>
-      <w:r>
-        <w:t xml:space="preserve"> (University of Connecticut / Complexity Science Hub Vienna) — quantitative historical dynamics (cliodynamics)</w:t>
-      </w:r>
-    </w:p>
-    <w:p/>
-    <w:p>
-      <w:r>
-        <w:t>Thank you for considering our submission. We look forward to your response.</w:t>
+        <w:t>• Prof. Nathan Nunn (University of British Columbia) — long-run persistence and historical institutions</w:t>
       </w:r>
     </w:p>
     <w:p/>
@@ -150,17 +107,21 @@
     <w:p>
       <w:r>
         <w:t>[Author Name]</w:t>
-        <w:br/>
+      </w:r>
+    </w:p>
+    <w:p>
+      <w:r>
         <w:t>[Affiliation]</w:t>
-        <w:br/>
+      </w:r>
+    </w:p>
+    <w:p>
+      <w:r>
         <w:t>[Email]</w:t>
-        <w:br/>
-        <w:t>[ORCID]</w:t>
       </w:r>
     </w:p>
     <w:sectPr>
       <w:pgSz w:w="12240" w:h="15840"/>
-      <w:pgMar w:top="1417" w:right="1417" w:bottom="1417" w:left="1417" w:header="720" w:footer="720" w:gutter="0"/>
+      <w:pgMar w:top="1440" w:right="1800" w:bottom="1440" w:left="1800" w:header="720" w:footer="720" w:gutter="0"/>
       <w:cols w:space="720"/>
       <w:docGrid w:linePitch="360"/>
     </w:sectPr>
@@ -532,7 +493,7 @@
     <w:qFormat/>
     <w:rsid w:val="00FC693F"/>
     <w:pPr>
-      <w:spacing w:line="360" w:lineRule="auto" w:after="120"/>
+      <w:spacing w:line="360" w:lineRule="auto"/>
     </w:pPr>
     <w:rPr>
       <w:rFonts w:ascii="Times New Roman" w:hAnsi="Times New Roman"/>

</xml_diff>

<commit_message>
E&P submission: political economy theoretical strengthening + cover letter
- Reframe DV as two-stage mechanism (exclusion → economic stagnation → institutional decay → political vulnerability)
- Add selectorate theory (Bueno de Mesquita 2003) for why rational rulers choose closure
- Strengthen modern extension as policy implications (semiconductor export controls)
- Theorize institutional quality channel as mediator (Baron-Kenny logic)
- Add political economy references (Besley & Persson 2011, Acemoglu & Robinson 2006, Bueno de Mesquita et al. 2003)
- Add JEL D72 (Political Processes)
- New cover letter addressing E&P editors (Xu & Zauner)
- Regenerate manuscript.docx, cover_letter.docx, figures_pptx.pptx

Co-Authored-By: Tatsuki Onishi <bougtoir@gmail.com>
</commit_message>
<xml_diff>
--- a/manuscript/cover_letter.docx
+++ b/manuscript/cover_letter.docx
@@ -18,46 +18,69 @@
         <w:rPr>
           <w:i/>
         </w:rPr>
-        <w:t>Explorations in Economic History</w:t>
+        <w:t>Economics &amp; Politics</w:t>
       </w:r>
     </w:p>
     <w:p/>
     <w:p>
       <w:r>
-        <w:t>Dear Editors,</w:t>
+        <w:t>Dear Professors Xu and Zauner,</w:t>
       </w:r>
     </w:p>
     <w:p/>
     <w:p>
       <w:r>
-        <w:t>I am pleased to submit the manuscript entitled "Network Exclusion and State Collapse: From Maritime Isolation to Technological Access Denial in the Long Run of History" for consideration by Explorations in Economic History.</w:t>
+        <w:t>I am pleased to submit the manuscript entitled "Network Exclusion and State Collapse: From Maritime Isolation to Technological Access Denial in the Long Run of History" for consideration by Economics &amp; Politics.</w:t>
       </w:r>
     </w:p>
     <w:p>
       <w:r>
-        <w:t>Using a comparative dataset of 96 historical polities spanning antiquity to the present, we distinguish between deliberate closure (policy-based trade bans, sakoku, bloc membership) and what we term "technical network exclusion": involuntary disconnection from the dominant exchange network of an era due to geographic or technological constraints. The manuscript presents four features that we believe are of interest to the journal's readership.</w:t>
+        <w:t>This paper addresses a core question in political economy: how does structural exclusion from dominant technological networks interact with political institutions to determine state survival? Using a comparative dataset of 96 historical polities spanning antiquity to the present, we distinguish between deliberate closure—a policy choice by ruling coalitions seeking to preserve rents (maritime bans, sakoku, bloc membership)—and what we term "technical network exclusion": involuntary disconnection from the dominant exchange network of an era due to geographic or technological constraints.</w:t>
       </w:r>
     </w:p>
     <w:p>
       <w:r>
-        <w:t>First, a systematic sensitivity analysis demonstrates that reclassifying seven technically excluded polities transforms a non-significant association between closure and conquest (Fisher's exact p = 0.187) into a significant one (p = 0.020), while the core stock–flow odds ratio remains stable (OR = 1.774).</w:t>
+        <w:t>We propose a two-stage political economy mechanism. First, network exclusion disrupts the flow of frontier technology, leading to economic stagnation and declining state capacity. Second, weakened economic performance erodes institutional quality and political resilience—the fiscal capacity to maintain armies, the administrative capacity to govern effectively, and the legitimacy that sustained growth provides to ruling coalitions. This framework connects the literatures on institutions and state capacity (Besley and Persson, 2011; Acemoglu and Robinson, 2006) with the literature on trade, technology diffusion, and isolation.</w:t>
       </w:r>
     </w:p>
     <w:p>
       <w:r>
-        <w:t>Second, we analyze conditional closure—cases where polities maintained selective technology channels while restricting broader trade. Examples include Tokugawa Japan's rangaku through Dejima, Qing China's Canton system, Joseon Korea's tributary trade, and the Soviet Union's bloc-internal technology sharing. The mixed outcomes of these cases suggest that the open/closed dichotomy is insufficient; the conditions under which selective channels mitigate technology gaps merit further investigation.</w:t>
+        <w:t>The paper presents four principal contributions:</w:t>
       </w:r>
     </w:p>
     <w:p>
+      <w:pPr>
+        <w:ind w:left="720"/>
+      </w:pPr>
       <w:r>
-        <w:t>Third, the dose–response gradient across closure types—technical exclusion (100% conquest) &gt; policy bans &gt; sakoku (with partial conduit) &gt; bloc &gt; open—points to technology flow disruption, rather than trade restriction per se, as the critical mechanism.</w:t>
+        <w:t>1. A systematic sensitivity analysis demonstrating that reclassifying seven technically excluded polities transforms a non-significant closure–conquest association (Fisher's exact p = 0.187) into a significant one (p = 0.020), while the core stock–flow odds ratio remains stable (OR = 1.774).</w:t>
       </w:r>
     </w:p>
     <w:p>
+      <w:pPr>
+        <w:ind w:left="720"/>
+      </w:pPr>
       <w:r>
-        <w:t>Fourth, the mechanism generalizes beyond geographic isolation: as the dominant network shifts from sea lanes to semiconductors, AI, and advanced robotics, states structurally excluded from these platforms may face analogous vulnerabilities.</w:t>
+        <w:t>2. A political economy analysis of closure as a policy choice, connecting selectorate theory (Bueno de Mesquita et al., 2003) to the logic of network exclusion: rulers with narrow winning coalitions may rationally choose closure despite its long-run costs, creating a tension between regime survival and state survival.</w:t>
       </w:r>
     </w:p>
+    <w:p>
+      <w:pPr>
+        <w:ind w:left="720"/>
+      </w:pPr>
+      <w:r>
+        <w:t>3. Empirical evidence for a mediated causal pathway (exclusion → economic stagnation → institutional decay → political vulnerability), supported by the multivariate regression pattern in which institutional quality and external threat absorb the closure effect, and by the PSM results consistent with full mediation.</w:t>
+      </w:r>
+    </w:p>
+    <w:p>
+      <w:pPr>
+        <w:ind w:left="720"/>
+      </w:pPr>
+      <w:r>
+        <w:t>4. Contemporary policy implications for the political economy of technology export controls—framing modern semiconductor and AI restrictions as deliberate exclusion policies whose long-run consequences can be assessed through the historical lens documented here.</w:t>
+      </w:r>
+    </w:p>
+    <w:p/>
     <w:p>
       <w:r>
         <w:t>We probe the closure–conquest association with four causal identification strategies—instrumental variables, propensity score matching, a natural experiment framing, and a robustness battery including E-values, permutation tests, and leave-one-out analysis. The strongest evidence comes from the natural experiment approach: technically excluded polities show a 100% conquest rate compared with 62.3% for open polities (Fisher's exact p = 0.048), with no significant differences in observable covariates.</w:t>
@@ -65,12 +88,17 @@
     </w:p>
     <w:p>
       <w:r>
-        <w:t>The manuscript contains approximately 7,000 words, 5 tables, and 4 figures. Supplementary Table S1 provides the complete dataset. We confirm that this work has not been published or submitted elsewhere.</w:t>
+        <w:t>The manuscript contains approximately 8,000 words, 5 tables, and 4 figures. Supplementary Table S1 provides the complete dataset. We confirm that this work has not been published or submitted elsewhere.</w:t>
       </w:r>
     </w:p>
     <w:p>
       <w:r>
-        <w:t>We suggest the following reviewers based on their expertise in quantitative economic history:</w:t>
+        <w:t>We believe this manuscript is well suited to Economics &amp; Politics because it addresses the interaction of political processes (policy choices regarding openness, selectorate dynamics) with economic outcomes (technology flow, state capacity) in determining political survival—a question at the core of the journal's scope.</w:t>
+      </w:r>
+    </w:p>
+    <w:p>
+      <w:r>
+        <w:t>We suggest the following reviewers based on their expertise in political economy and long-run development:</w:t>
       </w:r>
     </w:p>
     <w:p>
@@ -78,7 +106,7 @@
         <w:ind w:left="720"/>
       </w:pPr>
       <w:r>
-        <w:t>• Prof. Jörg Baten (University of Tübingen) — cliometric methods and long-run development</w:t>
+        <w:t>• Prof. Daron Acemoglu (MIT) — political institutions, economic development, and state capacity</w:t>
       </w:r>
     </w:p>
     <w:p>
@@ -86,7 +114,7 @@
         <w:ind w:left="720"/>
       </w:pPr>
       <w:r>
-        <w:t>• Prof. Stephen Broadberry (University of Oxford) — comparative economic history and GDP estimation</w:t>
+        <w:t>• Prof. Torsten Persson (Stockholm University) — political economics, fiscal capacity, and state formation</w:t>
       </w:r>
     </w:p>
     <w:p>
@@ -94,7 +122,7 @@
         <w:ind w:left="720"/>
       </w:pPr>
       <w:r>
-        <w:t>• Prof. Nathan Nunn (University of British Columbia) — long-run persistence and historical institutions</w:t>
+        <w:t>• Prof. Nathan Nunn (University of British Columbia) — long-run persistence, historical institutions, and trade</w:t>
       </w:r>
     </w:p>
     <w:p/>

</xml_diff>

<commit_message>
Add provenance audit and reproducible national-power dataset
Co-Authored-By: Tatsuki Onishi <bougtoir@gmail.com>
</commit_message>
<xml_diff>
--- a/manuscript/cover_letter.docx
+++ b/manuscript/cover_letter.docx
@@ -7,149 +7,53 @@
         <w:t>[Date]</w:t>
       </w:r>
     </w:p>
-    <w:p/>
     <w:p>
       <w:r>
         <w:t>The Editors</w:t>
+        <w:br/>
+        <w:t>Explorations in Economic History</w:t>
       </w:r>
     </w:p>
     <w:p>
       <w:r>
-        <w:rPr>
-          <w:i/>
-        </w:rPr>
-        <w:t>Economics &amp; Politics</w:t>
-      </w:r>
-    </w:p>
-    <w:p/>
-    <w:p>
-      <w:r>
-        <w:t>Dear Professors Xu and Zauner,</w:t>
-      </w:r>
-    </w:p>
-    <w:p/>
-    <w:p>
-      <w:r>
-        <w:t>I am pleased to submit the manuscript entitled "Network Exclusion and State Collapse: From Maritime Isolation to Technological Access Denial in the Long Run of History" for consideration by Economics &amp; Politics.</w:t>
+        <w:t>Dear Editors,</w:t>
       </w:r>
     </w:p>
     <w:p>
       <w:r>
-        <w:t>This paper addresses a core question in political economy: how does structural exclusion from dominant technological networks interact with political institutions to determine state survival? Using a comparative dataset of 96 historical polities spanning antiquity to the present, we distinguish between deliberate closure—a policy choice by ruling coalitions seeking to preserve rents (maritime bans, sakoku, bloc membership)—and what we term "technical network exclusion": involuntary disconnection from the dominant exchange network of an era due to geographic or technological constraints.</w:t>
+        <w:t>I am pleased to submit “Network Exclusion and State Collapse: From Maritime Isolation to Technological Access Denial in the Long Run of History” for consideration by Explorations in Economic History.</w:t>
       </w:r>
     </w:p>
     <w:p>
       <w:r>
-        <w:t>We propose a two-stage political economy mechanism. First, network exclusion disrupts the flow of frontier technology, leading to economic stagnation and declining state capacity. Second, weakened economic performance erodes institutional quality and political resilience—the fiscal capacity to maintain armies, the administrative capacity to govern effectively, and the legitimacy that sustained growth provides to ruling coalitions. This framework connects the literatures on institutions and state capacity (Besley and Persson, 2011; Acemoglu and Robinson, 2006) with the literature on trade, technology diffusion, and isolation.</w:t>
+        <w:t>The study uses an AI-assisted exploratory dataset of 96 historical polity-period cases rather than a public-data measurement dataset. It distinguishes deliberate closure from technical network exclusion and makes the complete editable coding and case-level source supplement publicly available.</w:t>
       </w:r>
     </w:p>
     <w:p>
       <w:r>
-        <w:t>The paper presents four principal contributions:</w:t>
-      </w:r>
-    </w:p>
-    <w:p>
-      <w:pPr>
-        <w:ind w:left="720"/>
-      </w:pPr>
-      <w:r>
-        <w:t>1. A systematic sensitivity analysis demonstrating that reclassifying seven technically excluded polities transforms a non-significant closure–conquest association (Fisher's exact p = 0.187) into a significant one (p = 0.020), while the core stock–flow odds ratio remains stable (OR = 1.774).</w:t>
-      </w:r>
-    </w:p>
-    <w:p>
-      <w:pPr>
-        <w:ind w:left="720"/>
-      </w:pPr>
-      <w:r>
-        <w:t>2. A political economy analysis of closure as a policy choice, connecting selectorate theory (Bueno de Mesquita et al., 2003) to the logic of network exclusion: rulers with narrow winning coalitions may rationally choose closure despite its long-run costs, creating a tension between regime survival and state survival.</w:t>
-      </w:r>
-    </w:p>
-    <w:p>
-      <w:pPr>
-        <w:ind w:left="720"/>
-      </w:pPr>
-      <w:r>
-        <w:t>3. Empirical evidence for a mediated causal pathway (exclusion → economic stagnation → institutional decay → political vulnerability), supported by the multivariate regression pattern in which institutional quality and external threat absorb the closure effect, and by the PSM results consistent with full mediation.</w:t>
-      </w:r>
-    </w:p>
-    <w:p>
-      <w:pPr>
-        <w:ind w:left="720"/>
-      </w:pPr>
-      <w:r>
-        <w:t>4. Contemporary policy implications for the political economy of technology export controls—framing modern semiconductor and AI restrictions as deliberate exclusion policies whose long-run consequences can be assessed through the historical lens documented here.</w:t>
-      </w:r>
-    </w:p>
-    <w:p/>
-    <w:p>
-      <w:r>
-        <w:t>We probe the closure–conquest association with four causal identification strategies—instrumental variables, propensity score matching, a natural experiment framing, and a robustness battery including E-values, permutation tests, and leave-one-out analysis. The strongest evidence comes from the natural experiment approach: technically excluded polities show a 100% conquest rate compared with 62.3% for open polities (Fisher's exact p = 0.048), with no significant differences in observable covariates.</w:t>
+        <w:t>In the post hoc sensitivity analysis, reclassifying 7 technically excluded polities changes the one-sided Fisher exact p-value from 0.187 to 0.020; the stock–flow odds ratio remains 1.774. The candidates have a 100.0% conquest rate in the current codings, but closure-category rates are not strictly monotonic, so technology-flow disruption is presented as a hypothesis rather than an identified mechanism.</w:t>
       </w:r>
     </w:p>
     <w:p>
       <w:r>
-        <w:t>The manuscript contains approximately 8,000 words, 5 tables, and 4 figures. Supplementary Table S1 provides the complete dataset. We confirm that this work has not been published or submitted elsewhere.</w:t>
+        <w:t>The manuscript includes analysis tables, figures, a complete supplementary dataset, variable metadata, and a field-level historical source supplement. [Before submission, please confirm that the work is not under consideration elsewhere.]</w:t>
       </w:r>
     </w:p>
     <w:p>
       <w:r>
-        <w:t>We believe this manuscript is well suited to Economics &amp; Politics because it addresses the interaction of political processes (policy choices regarding openness, selectorate dynamics) with economic outcomes (technology flow, state capacity) in determining political survival—a question at the core of the journal's scope.</w:t>
-      </w:r>
-    </w:p>
-    <w:p>
-      <w:r>
-        <w:t>We suggest the following reviewers based on their expertise in political economy and long-run development:</w:t>
-      </w:r>
-    </w:p>
-    <w:p>
-      <w:pPr>
-        <w:ind w:left="720"/>
-      </w:pPr>
-      <w:r>
-        <w:t>• Prof. Daron Acemoglu (MIT) — political institutions, economic development, and state capacity</w:t>
-      </w:r>
-    </w:p>
-    <w:p>
-      <w:pPr>
-        <w:ind w:left="720"/>
-      </w:pPr>
-      <w:r>
-        <w:t>• Prof. Torsten Persson (Stockholm University) — political economics, fiscal capacity, and state formation</w:t>
-      </w:r>
-    </w:p>
-    <w:p>
-      <w:pPr>
-        <w:ind w:left="720"/>
-      </w:pPr>
-      <w:r>
-        <w:t>• Prof. Nathan Nunn (University of British Columbia) — long-run persistence, historical institutions, and trade</w:t>
-      </w:r>
-    </w:p>
-    <w:p/>
-    <w:p>
-      <w:r>
         <w:t>Sincerely,</w:t>
-      </w:r>
-    </w:p>
-    <w:p/>
-    <w:p>
-      <w:r>
+        <w:br/>
+        <w:br/>
         <w:t>[Author Name]</w:t>
-      </w:r>
-    </w:p>
-    <w:p>
-      <w:r>
+        <w:br/>
         <w:t>[Affiliation]</w:t>
-      </w:r>
-    </w:p>
-    <w:p>
-      <w:r>
+        <w:br/>
         <w:t>[Email]</w:t>
       </w:r>
     </w:p>
     <w:sectPr>
       <w:pgSz w:w="12240" w:h="15840"/>
-      <w:pgMar w:top="1440" w:right="1800" w:bottom="1440" w:left="1800" w:header="720" w:footer="720" w:gutter="0"/>
+      <w:pgMar w:top="1417" w:right="1417" w:bottom="1417" w:left="1417" w:header="720" w:footer="720" w:gutter="0"/>
       <w:cols w:space="720"/>
       <w:docGrid w:linePitch="360"/>
     </w:sectPr>
@@ -520,9 +424,6 @@
     <w:name w:val="Normal"/>
     <w:qFormat/>
     <w:rsid w:val="00FC693F"/>
-    <w:pPr>
-      <w:spacing w:line="360" w:lineRule="auto"/>
-    </w:pPr>
     <w:rPr>
       <w:rFonts w:ascii="Times New Roman" w:hAnsi="Times New Roman"/>
       <w:sz w:val="24"/>

</xml_diff>